<commit_message>
Fix inhibitor history and ECOG conflict rules
</commit_message>
<xml_diff>
--- a/artifacts/TrialMatch_AI_Demo_Recording_Instructions.docx
+++ b/artifacts/TrialMatch_AI_Demo_Recording_Instructions.docx
@@ -991,7 +991,17 @@
         <w:pStyle w:val="Compact"/>
       </w:pPr>
       <w:r>
-        <w:t xml:space="preserve">The trial-level review label</w:t>
+        <w:t xml:space="preserve">The label</w:t>
+      </w:r>
+      <w:r>
+        <w:t xml:space="preserve"> </w:t>
+      </w:r>
+      <w:r>
+        <w:rPr>
+          <w:bCs/>
+          <w:b/>
+        </w:rPr>
+        <w:t xml:space="preserve">Potential match - needs verification</w:t>
       </w:r>
     </w:p>
     <w:p>
@@ -1003,7 +1013,7 @@
         <w:pStyle w:val="Compact"/>
       </w:pPr>
       <w:r>
-        <w:t xml:space="preserve">Meets count</w:t>
+        <w:t xml:space="preserve">Meets count: 4</w:t>
       </w:r>
     </w:p>
     <w:p>
@@ -1015,7 +1025,7 @@
         <w:pStyle w:val="Compact"/>
       </w:pPr>
       <w:r>
-        <w:t xml:space="preserve">Does Not Meet count</w:t>
+        <w:t xml:space="preserve">Does Not Meet count: 0</w:t>
       </w:r>
     </w:p>
     <w:p>
@@ -1027,7 +1037,7 @@
         <w:pStyle w:val="Compact"/>
       </w:pPr>
       <w:r>
-        <w:t xml:space="preserve">Unknown count</w:t>
+        <w:t xml:space="preserve">Unknown count: 46</w:t>
       </w:r>
     </w:p>
     <w:p>
@@ -1039,7 +1049,7 @@
         <w:pStyle w:val="Compact"/>
       </w:pPr>
       <w:r>
-        <w:t xml:space="preserve">Potential Conflict count</w:t>
+        <w:t xml:space="preserve">Potential Conflict count: 1</w:t>
       </w:r>
     </w:p>
     <w:p>
@@ -1307,7 +1317,79 @@
         <w:pStyle w:val="FirstParagraph"/>
       </w:pPr>
       <w:r>
-        <w:t xml:space="preserve">Continue within the same trial until an assessment marked</w:t>
+        <w:t xml:space="preserve">Within the same trial, show</w:t>
+      </w:r>
+      <w:r>
+        <w:t xml:space="preserve"> </w:t>
+      </w:r>
+      <w:r>
+        <w:rPr>
+          <w:rStyle w:val="VerbatimChar"/>
+        </w:rPr>
+        <w:t xml:space="preserve">INC-11</w:t>
+      </w:r>
+      <w:r>
+        <w:t xml:space="preserve"> </w:t>
+      </w:r>
+      <w:r>
+        <w:t xml:space="preserve">as</w:t>
+      </w:r>
+      <w:r>
+        <w:t xml:space="preserve"> </w:t>
+      </w:r>
+      <w:r>
+        <w:rPr>
+          <w:rStyle w:val="VerbatimChar"/>
+        </w:rPr>
+        <w:t xml:space="preserve">POTENTIAL_CONFLICT</w:t>
+      </w:r>
+      <w:r>
+        <w:t xml:space="preserve">. Explain that ECOG</w:t>
+      </w:r>
+      <w:r>
+        <w:t xml:space="preserve"> </w:t>
+      </w:r>
+      <w:r>
+        <w:t xml:space="preserve">1 meets the trial's ECOG 0-or-1 requirement while ECOG 2 does not, so both</w:t>
+      </w:r>
+      <w:r>
+        <w:t xml:space="preserve"> </w:t>
+      </w:r>
+      <w:r>
+        <w:t xml:space="preserve">documented outcomes remain visible.</w:t>
+      </w:r>
+    </w:p>
+    <w:p>
+      <w:pPr>
+        <w:pStyle w:val="BodyText"/>
+      </w:pPr>
+      <w:r>
+        <w:t xml:space="preserve">Then find</w:t>
+      </w:r>
+      <w:r>
+        <w:t xml:space="preserve"> </w:t>
+      </w:r>
+      <w:r>
+        <w:rPr>
+          <w:rStyle w:val="VerbatimChar"/>
+        </w:rPr>
+        <w:t xml:space="preserve">EXC-02</w:t>
+      </w:r>
+      <w:r>
+        <w:t xml:space="preserve">,</w:t>
+      </w:r>
+      <w:r>
+        <w:t xml:space="preserve"> </w:t>
+      </w:r>
+      <w:r>
+        <w:rPr>
+          <w:bCs/>
+          <w:b/>
+        </w:rPr>
+        <w:t xml:space="preserve">Prior KRASG12C inhibition therapy</w:t>
+      </w:r>
+      <w:r>
+        <w:t xml:space="preserve">. It should be</w:t>
       </w:r>
       <w:r>
         <w:t xml:space="preserve"> </w:t>
@@ -1319,16 +1401,13 @@
         <w:t xml:space="preserve">UNKNOWN</w:t>
       </w:r>
       <w:r>
+        <w:t xml:space="preserve">: mutation evidence does not prove that the patient received a KRAS</w:t>
+      </w:r>
+      <w:r>
         <w:t xml:space="preserve"> </w:t>
       </w:r>
       <w:r>
-        <w:t xml:space="preserve">is visible.</w:t>
-      </w:r>
-      <w:r>
-        <w:t xml:space="preserve"> </w:t>
-      </w:r>
-      <w:r>
-        <w:t xml:space="preserve">There is no need to read the entire criterion.</w:t>
+        <w:t xml:space="preserve">G12C inhibitor. There is no need to read every other unknown criterion.</w:t>
       </w:r>
     </w:p>
     <w:p>

</xml_diff>